<commit_message>
Fix heading first-line indentation behavior
</commit_message>
<xml_diff>
--- a/demo/online/briefing-简报/20260404-“我的刀盾”网络动态简报-v01.docx
+++ b/demo/online/briefing-简报/20260404-“我的刀盾”网络动态简报-v01.docx
@@ -18,7 +18,7 @@
     </w:p>
     <w:p>
       <w:pPr>
-        <w:ind w:leftChars="200" w:left="632"/>
+        <w:ind w:firstLineChars="200" w:firstLine="632"/>
         <w:spacing w:before="0" w:after="0" w:line="600" w:lineRule="exact"/>
       </w:pPr>
       <w:r>
@@ -46,7 +46,7 @@
     </w:p>
     <w:p>
       <w:pPr>
-        <w:ind w:leftChars="200" w:left="632"/>
+        <w:ind w:firstLineChars="200" w:firstLine="632"/>
         <w:spacing w:before="0" w:after="0" w:line="600" w:lineRule="exact"/>
       </w:pPr>
       <w:r>
@@ -168,7 +168,7 @@
     </w:p>
     <w:p>
       <w:pPr>
-        <w:ind w:leftChars="200" w:left="632"/>
+        <w:ind w:firstLineChars="200" w:firstLine="632"/>
         <w:spacing w:before="0" w:after="0" w:line="600" w:lineRule="exact"/>
       </w:pPr>
       <w:r>

</xml_diff>